<commit_message>
docs: cảnh báo CSDL Render Free hết hạn ~27/09/2026, sửa phiên bản PostgreSQL (16 cục bộ / 18 Render), cập nhật báo cáo + hướng dẫn deploy, sửa trạng thái Sprint 5 ở trang chủ
</commit_message>
<xml_diff>
--- a/docs/BAO-CAO-DO-AN-LearnQuiz.docx
+++ b/docs/BAO-CAO-DO-AN-LearnQuiz.docx
@@ -11417,7 +11417,7 @@
                 <w:sz w:val="24"/>
                 <w:szCs w:val="24"/>
               </w:rPr>
-              <w:t xml:space="preserve">PostgreSQL 16</w:t>
+              <w:t xml:space="preserve">PostgreSQL 16 (Docker cục bộ) / 18 (Render production)</w:t>
             </w:r>
           </w:p>
         </w:tc>
@@ -11443,7 +11443,7 @@
                 <w:sz w:val="24"/>
                 <w:szCs w:val="24"/>
               </w:rPr>
-              <w:t xml:space="preserve">Quan hệ và ràng buộc duy nhất phức hợp là trung tâm của đề tài</w:t>
+              <w:t xml:space="preserve">Quan hệ và ràng buộc duy nhất phức hợp là trung tâm của đề tài; Prisma tương thích cả hai phiên bản</w:t>
             </w:r>
           </w:p>
         </w:tc>
@@ -46654,7 +46654,17 @@
                 <w:sz w:val="24"/>
                 <w:szCs w:val="24"/>
               </w:rPr>
-              <w:t xml:space="preserve"> trả về trạng thái tốt · front-end tải được, không lỗi CORS · migration đã áp dụng và dữ liệu mẫu đã nạp · không biến môi trường nào còn trỏ về máy cục bộ</w:t>
+              <w:t xml:space="preserve"> trả về trạng thái tốt · front-end tải được, không lỗi CORS · migration đã áp dụng và dữ liệu mẫu đã nạp · không biến môi trường nào còn trỏ về máy cục bộ · </w:t>
+            </w:r>
+            <w:r>
+              <w:rPr>
+                <w:rFonts w:ascii="Times New Roman" w:cs="Times New Roman" w:eastAsia="Times New Roman" w:hAnsi="Times New Roman"/>
+                <w:b/>
+                <w:bCs/>
+                <w:sz w:val="24"/>
+                <w:szCs w:val="24"/>
+              </w:rPr>
+              <w:t xml:space="preserve">cơ sở dữ liệu Free trên Render chưa tới ngày hết hạn ~30 ngày kể từ lúc tạo — quá hạn sẽ bị xoá vĩnh viễn, phải nâng cấp hoặc tạo lại trước ngày bảo vệ</w:t>
             </w:r>
           </w:p>
         </w:tc>

</xml_diff>

<commit_message>
fix: cập nhật model Gemini còn được hỗ trợ (gemini-2.0-flash đã bị Google ngừng hoạt động từ 01/06/2026 -> gemini-3.6-flash), sửa tài liệu ghi sai cổng PostgreSQL cục bộ (5432 -> 5433), thêm ghi chú kiểm chứng vào kế hoạch sửa chữa
</commit_message>
<xml_diff>
--- a/docs/BAO-CAO-DO-AN-LearnQuiz.docx
+++ b/docs/BAO-CAO-DO-AN-LearnQuiz.docx
@@ -12271,7 +12271,7 @@
                 <w:sz w:val="24"/>
                 <w:szCs w:val="24"/>
               </w:rPr>
-              <w:t xml:space="preserve">Google Gemini 2.0 Flash</w:t>
+              <w:t xml:space="preserve">Google Gemini 3.6 Flash</w:t>
             </w:r>
           </w:p>
         </w:tc>
@@ -12297,7 +12297,7 @@
                 <w:sz w:val="24"/>
                 <w:szCs w:val="24"/>
               </w:rPr>
-              <w:t xml:space="preserve">Đúng yêu cầu đề tài; hỗ trợ trả JSON theo lược đồ; chỉ gọi từ máy chủ</w:t>
+              <w:t xml:space="preserve">Đúng yêu cầu đề tài; hỗ trợ trả JSON theo lược đồ; chỉ gọi từ máy chủ (model 2.0 Flash ban đầu bị Google ngừng hỗ trợ từ 01/06/2026, đã nâng cấp)</w:t>
             </w:r>
           </w:p>
         </w:tc>
@@ -51776,7 +51776,7 @@
           <w:sz w:val="18"/>
           <w:szCs w:val="18"/>
         </w:rPr>
-        <w:t xml:space="preserve">docker compose up -d              # PostgreSQL cổng 5432, Adminer 8080</w:t>
+        <w:t xml:space="preserve">docker compose up -d              # PostgreSQL cổng 5433, Adminer 8080</w:t>
       </w:r>
     </w:p>
     <w:p>

</xml_diff>

<commit_message>
fix: hoàn tất các finding P1/P2 của review tiền tốt nghiệp (khóa lộ trình học F1, đóng vòng duyệt nội dung F2, chặn hard-delete mất dữ liệu học tập F3, transaction serializable chống race F4/F5, siết role student F6, chặn làm lại sau khi đạt F7, khóa passScore hồi tố F8, completeness khi gửi duyệt F9, lazy-load route F11, ESLint + CI gate F12); cập nhật tài liệu: số test 318/324 -> 344, điền tên học viên/GVHD, sửa cổng PostgreSQL
</commit_message>
<xml_diff>
--- a/docs/BAO-CAO-DO-AN-LearnQuiz.docx
+++ b/docs/BAO-CAO-DO-AN-LearnQuiz.docx
@@ -7131,7 +7131,7 @@
                 <w:sz w:val="24"/>
                 <w:szCs w:val="24"/>
               </w:rPr>
-              <w:t xml:space="preserve">Ba tính năng Gemini; Docker hai giai đoạn; GitHub Actions; cấu hình Render và Vercel; 318 phép kiểm thử</w:t>
+              <w:t xml:space="preserve">Ba tính năng Gemini; Docker hai giai đoạn; GitHub Actions; cấu hình Render và Vercel; 344 phép kiểm thử</w:t>
             </w:r>
           </w:p>
         </w:tc>
@@ -7723,7 +7723,7 @@
                 <w:sz w:val="24"/>
                 <w:szCs w:val="24"/>
               </w:rPr>
-              <w:t xml:space="preserve">318 phép — đạt 318/318</w:t>
+              <w:t xml:space="preserve">344 phép — đạt 344/344</w:t>
             </w:r>
           </w:p>
         </w:tc>
@@ -35893,7 +35893,7 @@
           <w:sz w:val="18"/>
           <w:szCs w:val="18"/>
         </w:rPr>
-        <w:t xml:space="preserve">│  ├─ tests/                   # 318 phép kiểm, chạy không cần cơ sở dữ liệu</w:t>
+        <w:t xml:space="preserve">│  ├─ tests/                   # 344 phép kiểm, chạy không cần cơ sở dữ liệu</w:t>
       </w:r>
     </w:p>
     <w:p>
@@ -41728,7 +41728,7 @@
           <w:sz w:val="26"/>
           <w:szCs w:val="26"/>
         </w:rPr>
-        <w:t xml:space="preserve">318/318 phép khẳng định đạt</w:t>
+        <w:t xml:space="preserve">344/344 phép khẳng định đạt</w:t>
       </w:r>
       <w:r>
         <w:rPr>
@@ -41925,7 +41925,7 @@
                 <w:sz w:val="22"/>
                 <w:szCs w:val="22"/>
               </w:rPr>
-              <w:t xml:space="preserve">grader.test.ts</w:t>
+              <w:t xml:space="preserve">env.test.ts</w:t>
             </w:r>
           </w:p>
         </w:tc>
@@ -41951,7 +41951,7 @@
                 <w:sz w:val="24"/>
                 <w:szCs w:val="24"/>
               </w:rPr>
-              <w:t xml:space="preserve">Luật chấm điểm và luật mở khóa bài học</w:t>
+              <w:t xml:space="preserve">Model Gemini mặc định không bị cấu hình cục bộ làm sai lệch</w:t>
             </w:r>
           </w:p>
         </w:tc>
@@ -41977,7 +41977,7 @@
                 <w:sz w:val="24"/>
                 <w:szCs w:val="24"/>
               </w:rPr>
-              <w:t xml:space="preserve">24</w:t>
+              <w:t xml:space="preserve">1</w:t>
             </w:r>
           </w:p>
         </w:tc>
@@ -42034,7 +42034,7 @@
                 <w:sz w:val="22"/>
                 <w:szCs w:val="22"/>
               </w:rPr>
-              <w:t xml:space="preserve">workflow.test.ts</w:t>
+              <w:t xml:space="preserve">grader.test.ts</w:t>
             </w:r>
           </w:p>
         </w:tc>
@@ -42060,7 +42060,7 @@
                 <w:sz w:val="24"/>
                 <w:szCs w:val="24"/>
               </w:rPr>
-              <w:t xml:space="preserve">Máy trạng thái khóa học — đủ 16 tổ hợp</w:t>
+              <w:t xml:space="preserve">Luật chấm điểm và luật mở khóa bài học</w:t>
             </w:r>
           </w:p>
         </w:tc>
@@ -42086,7 +42086,7 @@
                 <w:sz w:val="24"/>
                 <w:szCs w:val="24"/>
               </w:rPr>
-              <w:t xml:space="preserve">30</w:t>
+              <w:t xml:space="preserve">24</w:t>
             </w:r>
           </w:p>
         </w:tc>
@@ -42143,7 +42143,7 @@
                 <w:sz w:val="22"/>
                 <w:szCs w:val="22"/>
               </w:rPr>
-              <w:t xml:space="preserve">schema.test.ts</w:t>
+              <w:t xml:space="preserve">workflow.test.ts</w:t>
             </w:r>
           </w:p>
         </w:tc>
@@ -42169,7 +42169,7 @@
                 <w:sz w:val="24"/>
                 <w:szCs w:val="24"/>
               </w:rPr>
-              <w:t xml:space="preserve">Luật ra đề, luật nộp bài, bộ lọc quản trị, chống gán tràn thuộc tính</w:t>
+              <w:t xml:space="preserve">Máy trạng thái khóa học — đủ 16 tổ hợp</w:t>
             </w:r>
           </w:p>
         </w:tc>
@@ -42195,7 +42195,7 @@
                 <w:sz w:val="24"/>
                 <w:szCs w:val="24"/>
               </w:rPr>
-              <w:t xml:space="preserve">31</w:t>
+              <w:t xml:space="preserve">30</w:t>
             </w:r>
           </w:p>
         </w:tc>
@@ -42252,7 +42252,7 @@
                 <w:sz w:val="22"/>
                 <w:szCs w:val="22"/>
               </w:rPr>
-              <w:t xml:space="preserve">gemini.test.ts</w:t>
+              <w:t xml:space="preserve">schema.test.ts</w:t>
             </w:r>
           </w:p>
         </w:tc>
@@ -42278,7 +42278,7 @@
                 <w:sz w:val="24"/>
                 <w:szCs w:val="24"/>
               </w:rPr>
-              <w:t xml:space="preserve">Lớp gọi Gemini: JSON, lỗi mạng, quá thời gian, không lộ chi tiết lỗi</w:t>
+              <w:t xml:space="preserve">Luật ra đề, luật nộp bài, bộ lọc quản trị, chống gán tràn thuộc tính</w:t>
             </w:r>
           </w:p>
         </w:tc>
@@ -42304,7 +42304,7 @@
                 <w:sz w:val="24"/>
                 <w:szCs w:val="24"/>
               </w:rPr>
-              <w:t xml:space="preserve">18</w:t>
+              <w:t xml:space="preserve">31</w:t>
             </w:r>
           </w:p>
         </w:tc>
@@ -42361,7 +42361,7 @@
                 <w:sz w:val="22"/>
                 <w:szCs w:val="22"/>
               </w:rPr>
-              <w:t xml:space="preserve">quizService.test.ts</w:t>
+              <w:t xml:space="preserve">gemini.test.ts</w:t>
             </w:r>
           </w:p>
         </w:tc>
@@ -42387,7 +42387,7 @@
                 <w:sz w:val="24"/>
                 <w:szCs w:val="24"/>
               </w:rPr>
-              <w:t xml:space="preserve">Nghiệp vụ quiz đầu–cuối: phân quyền, chấm điểm, giới hạn lượt, khóa sửa đề</w:t>
+              <w:t xml:space="preserve">Lớp gọi Gemini: JSON, lỗi mạng, quá thời gian, không lộ chi tiết lỗi</w:t>
             </w:r>
           </w:p>
         </w:tc>
@@ -42413,7 +42413,7 @@
                 <w:sz w:val="24"/>
                 <w:szCs w:val="24"/>
               </w:rPr>
-              <w:t xml:space="preserve">47</w:t>
+              <w:t xml:space="preserve">18</w:t>
             </w:r>
           </w:p>
         </w:tc>
@@ -42470,7 +42470,7 @@
                 <w:sz w:val="22"/>
                 <w:szCs w:val="22"/>
               </w:rPr>
-              <w:t xml:space="preserve">adminService.test.ts</w:t>
+              <w:t xml:space="preserve">quizService.test.ts</w:t>
             </w:r>
           </w:p>
         </w:tc>
@@ -42496,7 +42496,7 @@
                 <w:sz w:val="24"/>
                 <w:szCs w:val="24"/>
               </w:rPr>
-              <w:t xml:space="preserve">Duyệt khóa học, quản lý người dùng, toàn bộ số liệu thống kê</w:t>
+              <w:t xml:space="preserve">Nghiệp vụ quiz đầu–cuối: phân quyền, chấm điểm, giới hạn lượt, khóa sửa đề, chặn làm lại sau khi đã đạt</w:t>
             </w:r>
           </w:p>
         </w:tc>
@@ -42522,7 +42522,7 @@
                 <w:sz w:val="24"/>
                 <w:szCs w:val="24"/>
               </w:rPr>
-              <w:t xml:space="preserve">75</w:t>
+              <w:t xml:space="preserve">49</w:t>
             </w:r>
           </w:p>
         </w:tc>
@@ -42579,7 +42579,7 @@
                 <w:sz w:val="22"/>
                 <w:szCs w:val="22"/>
               </w:rPr>
-              <w:t xml:space="preserve">aiService.test.ts</w:t>
+              <w:t xml:space="preserve">adminService.test.ts</w:t>
             </w:r>
           </w:p>
         </w:tc>
@@ -42605,7 +42605,7 @@
                 <w:sz w:val="24"/>
                 <w:szCs w:val="24"/>
               </w:rPr>
-              <w:t xml:space="preserve">Ba tính năng AI: phân quyền, kiểm duyệt đầu ra, bộ nhớ đệm</w:t>
+              <w:t xml:space="preserve">Duyệt khóa học, quản lý người dùng, toàn bộ số liệu thống kê</w:t>
             </w:r>
           </w:p>
         </w:tc>
@@ -42631,7 +42631,7 @@
                 <w:sz w:val="24"/>
                 <w:szCs w:val="24"/>
               </w:rPr>
-              <w:t xml:space="preserve">36</w:t>
+              <w:t xml:space="preserve">75</w:t>
             </w:r>
           </w:p>
         </w:tc>
@@ -42688,7 +42688,7 @@
                 <w:sz w:val="22"/>
                 <w:szCs w:val="22"/>
               </w:rPr>
-              <w:t xml:space="preserve">api.test.ts</w:t>
+              <w:t xml:space="preserve">aiService.test.ts</w:t>
             </w:r>
           </w:p>
         </w:tc>
@@ -42714,7 +42714,7 @@
                 <w:sz w:val="24"/>
                 <w:szCs w:val="24"/>
               </w:rPr>
-              <w:t xml:space="preserve">Bảng định tuyến thật và gọi HTTP qua toàn bộ chuỗi middleware</w:t>
+              <w:t xml:space="preserve">Ba tính năng AI: phân quyền, kiểm duyệt đầu ra, bộ nhớ đệm</w:t>
             </w:r>
           </w:p>
         </w:tc>
@@ -42740,7 +42740,7 @@
                 <w:sz w:val="24"/>
                 <w:szCs w:val="24"/>
               </w:rPr>
-              <w:t xml:space="preserve">57</w:t>
+              <w:t xml:space="preserve">36</w:t>
             </w:r>
           </w:p>
         </w:tc>
@@ -42793,6 +42793,333 @@
             </w:pPr>
             <w:r>
               <w:rPr>
+                <w:rFonts w:ascii="Courier New" w:cs="Courier New" w:eastAsia="Courier New" w:hAnsi="Courier New"/>
+                <w:sz w:val="22"/>
+                <w:szCs w:val="22"/>
+              </w:rPr>
+              <w:t xml:space="preserve">enrollmentService.test.ts</w:t>
+            </w:r>
+          </w:p>
+        </w:tc>
+        <w:tc>
+          <w:tcPr>
+            <w:tcW w:type="dxa" w:w="3992"/>
+            <w:tcMar>
+              <w:top w:type="dxa" w:w="60"/>
+              <w:left w:type="dxa" w:w="90"/>
+              <w:bottom w:type="dxa" w:w="60"/>
+              <w:right w:type="dxa" w:w="90"/>
+            </w:tcMar>
+            <w:vAlign w:val="center"/>
+          </w:tcPr>
+          <w:p>
+            <w:pPr>
+              <w:spacing w:after="0" w:line="240" w:lineRule="auto"/>
+              <w:jc w:val="left"/>
+            </w:pPr>
+            <w:r>
+              <w:rPr>
+                <w:rFonts w:ascii="Times New Roman" w:cs="Times New Roman" w:eastAsia="Times New Roman" w:hAnsi="Times New Roman"/>
+                <w:sz w:val="24"/>
+                <w:szCs w:val="24"/>
+              </w:rPr>
+              <w:t xml:space="preserve">Điểm quiz trung bình theo khóa học, lấy lượt có điểm cao nhất</w:t>
+            </w:r>
+          </w:p>
+        </w:tc>
+        <w:tc>
+          <w:tcPr>
+            <w:tcW w:type="dxa" w:w="1179"/>
+            <w:tcMar>
+              <w:top w:type="dxa" w:w="60"/>
+              <w:left w:type="dxa" w:w="90"/>
+              <w:bottom w:type="dxa" w:w="60"/>
+              <w:right w:type="dxa" w:w="90"/>
+            </w:tcMar>
+            <w:vAlign w:val="center"/>
+          </w:tcPr>
+          <w:p>
+            <w:pPr>
+              <w:spacing w:after="0" w:line="240" w:lineRule="auto"/>
+              <w:jc w:val="center"/>
+            </w:pPr>
+            <w:r>
+              <w:rPr>
+                <w:rFonts w:ascii="Times New Roman" w:cs="Times New Roman" w:eastAsia="Times New Roman" w:hAnsi="Times New Roman"/>
+                <w:sz w:val="24"/>
+                <w:szCs w:val="24"/>
+              </w:rPr>
+              <w:t xml:space="preserve">4</w:t>
+            </w:r>
+          </w:p>
+        </w:tc>
+        <w:tc>
+          <w:tcPr>
+            <w:tcW w:type="dxa" w:w="1179"/>
+            <w:tcMar>
+              <w:top w:type="dxa" w:w="60"/>
+              <w:left w:type="dxa" w:w="90"/>
+              <w:bottom w:type="dxa" w:w="60"/>
+              <w:right w:type="dxa" w:w="90"/>
+            </w:tcMar>
+            <w:vAlign w:val="center"/>
+          </w:tcPr>
+          <w:p>
+            <w:pPr>
+              <w:spacing w:after="0" w:line="240" w:lineRule="auto"/>
+              <w:jc w:val="center"/>
+            </w:pPr>
+            <w:r>
+              <w:rPr>
+                <w:rFonts w:ascii="Times New Roman" w:cs="Times New Roman" w:eastAsia="Times New Roman" w:hAnsi="Times New Roman"/>
+                <w:sz w:val="24"/>
+                <w:szCs w:val="24"/>
+              </w:rPr>
+              <w:t xml:space="preserve">Đạt</w:t>
+            </w:r>
+          </w:p>
+        </w:tc>
+      </w:tr>
+      <w:tr>
+        <w:trPr>
+          <w:cantSplit/>
+        </w:trPr>
+        <w:tc>
+          <w:tcPr>
+            <w:tcW w:type="dxa" w:w="2722"/>
+            <w:tcMar>
+              <w:top w:type="dxa" w:w="60"/>
+              <w:left w:type="dxa" w:w="90"/>
+              <w:bottom w:type="dxa" w:w="60"/>
+              <w:right w:type="dxa" w:w="90"/>
+            </w:tcMar>
+            <w:vAlign w:val="center"/>
+          </w:tcPr>
+          <w:p>
+            <w:pPr>
+              <w:spacing w:after="0" w:line="240" w:lineRule="auto"/>
+              <w:jc w:val="left"/>
+            </w:pPr>
+            <w:r>
+              <w:rPr>
+                <w:rFonts w:ascii="Courier New" w:cs="Courier New" w:eastAsia="Courier New" w:hAnsi="Courier New"/>
+                <w:sz w:val="22"/>
+                <w:szCs w:val="22"/>
+              </w:rPr>
+              <w:t xml:space="preserve">graduationRegression.test.ts</w:t>
+            </w:r>
+          </w:p>
+        </w:tc>
+        <w:tc>
+          <w:tcPr>
+            <w:tcW w:type="dxa" w:w="3992"/>
+            <w:tcMar>
+              <w:top w:type="dxa" w:w="60"/>
+              <w:left w:type="dxa" w:w="90"/>
+              <w:bottom w:type="dxa" w:w="60"/>
+              <w:right w:type="dxa" w:w="90"/>
+            </w:tcMar>
+            <w:vAlign w:val="center"/>
+          </w:tcPr>
+          <w:p>
+            <w:pPr>
+              <w:spacing w:after="0" w:line="240" w:lineRule="auto"/>
+              <w:jc w:val="left"/>
+            </w:pPr>
+            <w:r>
+              <w:rPr>
+                <w:rFonts w:ascii="Times New Roman" w:cs="Times New Roman" w:eastAsia="Times New Roman" w:hAnsi="Times New Roman"/>
+                <w:sz w:val="24"/>
+                <w:szCs w:val="24"/>
+              </w:rPr>
+              <w:t xml:space="preserve">Hồi quy theo review tốt nghiệp: khóa lộ trình, đóng vòng duyệt nội dung, chặn hard-delete có dữ liệu học tập, bất biến còn ít nhất 1 admin, snapshot điểm đạt</w:t>
+            </w:r>
+          </w:p>
+        </w:tc>
+        <w:tc>
+          <w:tcPr>
+            <w:tcW w:type="dxa" w:w="1179"/>
+            <w:tcMar>
+              <w:top w:type="dxa" w:w="60"/>
+              <w:left w:type="dxa" w:w="90"/>
+              <w:bottom w:type="dxa" w:w="60"/>
+              <w:right w:type="dxa" w:w="90"/>
+            </w:tcMar>
+            <w:vAlign w:val="center"/>
+          </w:tcPr>
+          <w:p>
+            <w:pPr>
+              <w:spacing w:after="0" w:line="240" w:lineRule="auto"/>
+              <w:jc w:val="center"/>
+            </w:pPr>
+            <w:r>
+              <w:rPr>
+                <w:rFonts w:ascii="Times New Roman" w:cs="Times New Roman" w:eastAsia="Times New Roman" w:hAnsi="Times New Roman"/>
+                <w:sz w:val="24"/>
+                <w:szCs w:val="24"/>
+              </w:rPr>
+              <w:t xml:space="preserve">16</w:t>
+            </w:r>
+          </w:p>
+        </w:tc>
+        <w:tc>
+          <w:tcPr>
+            <w:tcW w:type="dxa" w:w="1179"/>
+            <w:tcMar>
+              <w:top w:type="dxa" w:w="60"/>
+              <w:left w:type="dxa" w:w="90"/>
+              <w:bottom w:type="dxa" w:w="60"/>
+              <w:right w:type="dxa" w:w="90"/>
+            </w:tcMar>
+            <w:vAlign w:val="center"/>
+          </w:tcPr>
+          <w:p>
+            <w:pPr>
+              <w:spacing w:after="0" w:line="240" w:lineRule="auto"/>
+              <w:jc w:val="center"/>
+            </w:pPr>
+            <w:r>
+              <w:rPr>
+                <w:rFonts w:ascii="Times New Roman" w:cs="Times New Roman" w:eastAsia="Times New Roman" w:hAnsi="Times New Roman"/>
+                <w:sz w:val="24"/>
+                <w:szCs w:val="24"/>
+              </w:rPr>
+              <w:t xml:space="preserve">Đạt</w:t>
+            </w:r>
+          </w:p>
+        </w:tc>
+      </w:tr>
+      <w:tr>
+        <w:trPr>
+          <w:cantSplit/>
+        </w:trPr>
+        <w:tc>
+          <w:tcPr>
+            <w:tcW w:type="dxa" w:w="2722"/>
+            <w:tcMar>
+              <w:top w:type="dxa" w:w="60"/>
+              <w:left w:type="dxa" w:w="90"/>
+              <w:bottom w:type="dxa" w:w="60"/>
+              <w:right w:type="dxa" w:w="90"/>
+            </w:tcMar>
+            <w:vAlign w:val="center"/>
+          </w:tcPr>
+          <w:p>
+            <w:pPr>
+              <w:spacing w:after="0" w:line="240" w:lineRule="auto"/>
+              <w:jc w:val="left"/>
+            </w:pPr>
+            <w:r>
+              <w:rPr>
+                <w:rFonts w:ascii="Courier New" w:cs="Courier New" w:eastAsia="Courier New" w:hAnsi="Courier New"/>
+                <w:sz w:val="22"/>
+                <w:szCs w:val="22"/>
+              </w:rPr>
+              <w:t xml:space="preserve">api.test.ts</w:t>
+            </w:r>
+          </w:p>
+        </w:tc>
+        <w:tc>
+          <w:tcPr>
+            <w:tcW w:type="dxa" w:w="3992"/>
+            <w:tcMar>
+              <w:top w:type="dxa" w:w="60"/>
+              <w:left w:type="dxa" w:w="90"/>
+              <w:bottom w:type="dxa" w:w="60"/>
+              <w:right w:type="dxa" w:w="90"/>
+            </w:tcMar>
+            <w:vAlign w:val="center"/>
+          </w:tcPr>
+          <w:p>
+            <w:pPr>
+              <w:spacing w:after="0" w:line="240" w:lineRule="auto"/>
+              <w:jc w:val="left"/>
+            </w:pPr>
+            <w:r>
+              <w:rPr>
+                <w:rFonts w:ascii="Times New Roman" w:cs="Times New Roman" w:eastAsia="Times New Roman" w:hAnsi="Times New Roman"/>
+                <w:sz w:val="24"/>
+                <w:szCs w:val="24"/>
+              </w:rPr>
+              <w:t xml:space="preserve">Bảng định tuyến thật và gọi HTTP qua toàn bộ chuỗi middleware</w:t>
+            </w:r>
+          </w:p>
+        </w:tc>
+        <w:tc>
+          <w:tcPr>
+            <w:tcW w:type="dxa" w:w="1179"/>
+            <w:tcMar>
+              <w:top w:type="dxa" w:w="60"/>
+              <w:left w:type="dxa" w:w="90"/>
+              <w:bottom w:type="dxa" w:w="60"/>
+              <w:right w:type="dxa" w:w="90"/>
+            </w:tcMar>
+            <w:vAlign w:val="center"/>
+          </w:tcPr>
+          <w:p>
+            <w:pPr>
+              <w:spacing w:after="0" w:line="240" w:lineRule="auto"/>
+              <w:jc w:val="center"/>
+            </w:pPr>
+            <w:r>
+              <w:rPr>
+                <w:rFonts w:ascii="Times New Roman" w:cs="Times New Roman" w:eastAsia="Times New Roman" w:hAnsi="Times New Roman"/>
+                <w:sz w:val="24"/>
+                <w:szCs w:val="24"/>
+              </w:rPr>
+              <w:t xml:space="preserve">60</w:t>
+            </w:r>
+          </w:p>
+        </w:tc>
+        <w:tc>
+          <w:tcPr>
+            <w:tcW w:type="dxa" w:w="1179"/>
+            <w:tcMar>
+              <w:top w:type="dxa" w:w="60"/>
+              <w:left w:type="dxa" w:w="90"/>
+              <w:bottom w:type="dxa" w:w="60"/>
+              <w:right w:type="dxa" w:w="90"/>
+            </w:tcMar>
+            <w:vAlign w:val="center"/>
+          </w:tcPr>
+          <w:p>
+            <w:pPr>
+              <w:spacing w:after="0" w:line="240" w:lineRule="auto"/>
+              <w:jc w:val="center"/>
+            </w:pPr>
+            <w:r>
+              <w:rPr>
+                <w:rFonts w:ascii="Times New Roman" w:cs="Times New Roman" w:eastAsia="Times New Roman" w:hAnsi="Times New Roman"/>
+                <w:sz w:val="24"/>
+                <w:szCs w:val="24"/>
+              </w:rPr>
+              <w:t xml:space="preserve">Đạt</w:t>
+            </w:r>
+          </w:p>
+        </w:tc>
+      </w:tr>
+      <w:tr>
+        <w:trPr>
+          <w:cantSplit/>
+        </w:trPr>
+        <w:tc>
+          <w:tcPr>
+            <w:tcW w:type="dxa" w:w="2722"/>
+            <w:tcMar>
+              <w:top w:type="dxa" w:w="60"/>
+              <w:left w:type="dxa" w:w="90"/>
+              <w:bottom w:type="dxa" w:w="60"/>
+              <w:right w:type="dxa" w:w="90"/>
+            </w:tcMar>
+            <w:vAlign w:val="center"/>
+          </w:tcPr>
+          <w:p>
+            <w:pPr>
+              <w:spacing w:after="0" w:line="240" w:lineRule="auto"/>
+              <w:jc w:val="left"/>
+            </w:pPr>
+            <w:r>
+              <w:rPr>
                 <w:rFonts w:ascii="Times New Roman" w:cs="Times New Roman" w:eastAsia="Times New Roman" w:hAnsi="Times New Roman"/>
                 <w:b/>
                 <w:bCs/>
@@ -42845,7 +43172,7 @@
                 <w:sz w:val="24"/>
                 <w:szCs w:val="24"/>
               </w:rPr>
-              <w:t xml:space="preserve">318</w:t>
+              <w:t xml:space="preserve">344</w:t>
             </w:r>
           </w:p>
         </w:tc>
@@ -42873,7 +43200,7 @@
                 <w:sz w:val="24"/>
                 <w:szCs w:val="24"/>
               </w:rPr>
-              <w:t xml:space="preserve">318/318</w:t>
+              <w:t xml:space="preserve">344/344</w:t>
             </w:r>
           </w:p>
         </w:tc>
@@ -44963,7 +45290,7 @@
                 <w:sz w:val="24"/>
                 <w:szCs w:val="24"/>
               </w:rPr>
-              <w:t xml:space="preserve">Kiểm tra lược đồ Prisma → kiểm tra kiểu → chạy 318 phép kiểm → biên dịch</w:t>
+              <w:t xml:space="preserve">Kiểm tra lược đồ Prisma → kiểm tra kiểu → rà quy chuẩn mã (lint) → chạy 344 phép kiểm → biên dịch</w:t>
             </w:r>
           </w:p>
         </w:tc>
@@ -45046,7 +45373,7 @@
                 <w:sz w:val="24"/>
                 <w:szCs w:val="24"/>
               </w:rPr>
-              <w:t xml:space="preserve">Kiểm tra kiểu → dựng bản phát hành</w:t>
+              <w:t xml:space="preserve">Kiểm tra kiểu → rà quy chuẩn mã (lint) → 10 unit test → dựng bản phát hành</w:t>
             </w:r>
           </w:p>
         </w:tc>
@@ -46826,7 +47153,7 @@
                 <w:sz w:val="24"/>
                 <w:szCs w:val="24"/>
               </w:rPr>
-              <w:t xml:space="preserve">Biên dịch sạch lỗi ở cả hai dự án · 318/318 phép kiểm đạt · không còn lệnh in ra màn hình sót lại · mọi tuyến bất đồng bộ đều bắt lỗi và chuyển về bộ xử lý lỗi</w:t>
+              <w:t xml:space="preserve">Biên dịch sạch lỗi ở cả hai dự án · 344/344 phép kiểm đạt · ESLint không còn cảnh báo · không còn lệnh in ra màn hình sót lại · mọi tuyến bất đồng bộ đều bắt lỗi và chuyển về bộ xử lý lỗi</w:t>
             </w:r>
           </w:p>
         </w:tc>
@@ -46939,7 +47266,7 @@
           <w:sz w:val="26"/>
           <w:szCs w:val="26"/>
         </w:rPr>
-        <w:t xml:space="preserve">Đối chiếu với mục tiêu đặt ra ở mục 1.2, toàn bộ hạng mục bắt buộc của đề tài đã hoàn thành: đủ chức năng của ba vai trò, ba tính năng AI, đóng gói bằng Docker, tích hợp liên tục và cấu hình triển khai lên môi trường thật. Bộ kiểm thử tự động đạt 318/318 và bao phủ toàn bộ các quy tắc nghiệp vụ then chốt.</w:t>
+        <w:t xml:space="preserve">Đối chiếu với mục tiêu đặt ra ở mục 1.2, toàn bộ hạng mục bắt buộc của đề tài đã hoàn thành: đủ chức năng của ba vai trò, ba tính năng AI, đóng gói bằng Docker, tích hợp liên tục và cấu hình triển khai lên môi trường thật. Bộ kiểm thử tự động đạt 344/344 và bao phủ toàn bộ các quy tắc nghiệp vụ then chốt, gồm cả bộ hồi quy bổ sung sau đợt review tiền bảo vệ (khóa lộ trình học, vòng đời duyệt nội dung, toàn vẹn dữ liệu khi xóa/sửa đồng thời).</w:t>
       </w:r>
     </w:p>
     <w:p>
@@ -53083,7 +53410,7 @@
                 <w:sz w:val="24"/>
                 <w:szCs w:val="24"/>
               </w:rPr>
-              <w:t xml:space="preserve">Chạy 318 phép kiểm thử — </w:t>
+              <w:t xml:space="preserve">Chạy 344 phép kiểm thử — </w:t>
             </w:r>
             <w:r>
               <w:rPr>

</xml_diff>

<commit_message>
docs: dong bo Bang 1.6 va slide 15 voi so lieu ma nguon tai 3d5aa09
Phan ma them vao hom nay (LearnPage, axiosClient, e2e, CourseListPage) lam ba
con so trong ho so lech lai:
- Tong tep ma nguon va cau hinh : 161 -> 162
- Ma nguon front-end            : 6.174 -> 6.215 dong (52 tep, khong doi)
- Ma nguon kiem thu             : 1.993 -> 2.078 dong (18 tep, khong doi)
- Slide 15, tong dong TypeScript: 10.469 -> 10.510

Back-end (4.295/58), CSDL (11 bang / 3 enum / 217 dong), diem cuoi API (46),
man hinh (21) va so phep khang dinh (345) khong doi.

SLIDE pptx + pdf da xuat lai bang PowerPoint (17 trang). DOCX da sua; ban PDF
cua bao cao can xuat tay vi ExportAsFixedFormat qua COM van treo tren may nay.
</commit_message>
<xml_diff>
--- a/docs/BAO-CAO-DO-AN-LearnQuiz.docx
+++ b/docs/BAO-CAO-DO-AN-LearnQuiz.docx
@@ -16017,7 +16017,7 @@
                 <w:sz w:val="24"/>
                 <w:szCs w:val="24"/>
               </w:rPr>
-              <w:t>161 tệp</w:t>
+              <w:t>162 tệp</w:t>
             </w:r>
           </w:p>
         </w:tc>
@@ -16127,7 +16127,7 @@
                 <w:sz w:val="24"/>
                 <w:szCs w:val="24"/>
               </w:rPr>
-              <w:t>6.174 dòng / 52 tệp</w:t>
+              <w:t>6.215 dòng / 52 tệp</w:t>
             </w:r>
           </w:p>
         </w:tc>
@@ -16182,7 +16182,7 @@
                 <w:sz w:val="24"/>
                 <w:szCs w:val="24"/>
               </w:rPr>
-              <w:t>1.993 dòng / 18 tệp</w:t>
+              <w:t>2.078 dòng / 18 tệp</w:t>
             </w:r>
           </w:p>
         </w:tc>

</xml_diff>